<commit_message>
hands on exercise 7
</commit_message>
<xml_diff>
--- a/Notes/Lesson 6 (Shiny).docx
+++ b/Notes/Lesson 6 (Shiny).docx
@@ -66,6 +66,7 @@
       <w:r>
         <w:rPr>
           <w:rFonts w:ascii="Tahoma" w:hAnsi="Tahoma" w:cs="Tahoma"/>
+          <w:noProof/>
           <w:sz w:val="20"/>
           <w:szCs w:val="20"/>
         </w:rPr>
@@ -146,6 +147,7 @@
       <w:r>
         <w:rPr>
           <w:rFonts w:ascii="Tahoma" w:hAnsi="Tahoma" w:cs="Tahoma"/>
+          <w:noProof/>
           <w:sz w:val="20"/>
           <w:szCs w:val="20"/>
         </w:rPr>
@@ -204,7 +206,6 @@
         <w:t xml:space="preserve">If have multiple libraries can just use </w:t>
       </w:r>
       <w:proofErr w:type="spellStart"/>
-      <w:proofErr w:type="gramStart"/>
       <w:r>
         <w:rPr>
           <w:rFonts w:ascii="Tahoma" w:hAnsi="Tahoma" w:cs="Tahoma"/>
@@ -223,7 +224,6 @@
         <w:t>::</w:t>
       </w:r>
       <w:proofErr w:type="spellStart"/>
-      <w:proofErr w:type="gramEnd"/>
       <w:r>
         <w:rPr>
           <w:rFonts w:ascii="Tahoma" w:hAnsi="Tahoma" w:cs="Tahoma"/>
@@ -264,6 +264,7 @@
       <w:r>
         <w:rPr>
           <w:rFonts w:ascii="Tahoma" w:hAnsi="Tahoma" w:cs="Tahoma"/>
+          <w:noProof/>
           <w:sz w:val="20"/>
           <w:szCs w:val="20"/>
         </w:rPr>
@@ -398,6 +399,7 @@
       <w:r>
         <w:rPr>
           <w:rFonts w:ascii="Tahoma" w:hAnsi="Tahoma" w:cs="Tahoma"/>
+          <w:noProof/>
           <w:sz w:val="20"/>
           <w:szCs w:val="20"/>
         </w:rPr>
@@ -448,7 +450,6 @@
         </w:rPr>
       </w:pPr>
       <w:proofErr w:type="spellStart"/>
-      <w:proofErr w:type="gramStart"/>
       <w:r>
         <w:rPr>
           <w:rFonts w:ascii="Tahoma" w:hAnsi="Tahoma" w:cs="Tahoma"/>
@@ -464,16 +465,7 @@
           <w:sz w:val="20"/>
           <w:szCs w:val="20"/>
         </w:rPr>
-        <w:t>(</w:t>
-      </w:r>
-      <w:proofErr w:type="gramEnd"/>
-      <w:r>
-        <w:rPr>
-          <w:rFonts w:ascii="Tahoma" w:hAnsi="Tahoma" w:cs="Tahoma"/>
-          <w:sz w:val="20"/>
-          <w:szCs w:val="20"/>
-        </w:rPr>
-        <w:t xml:space="preserve">) and </w:t>
+        <w:t xml:space="preserve">() and </w:t>
       </w:r>
       <w:proofErr w:type="spellStart"/>
       <w:r>
@@ -492,6 +484,859 @@
           <w:szCs w:val="20"/>
         </w:rPr>
         <w:t>() will add up to 12</w:t>
+      </w:r>
+    </w:p>
+    <w:p>
+      <w:pPr>
+        <w:spacing w:after="0" w:line="240" w:lineRule="auto"/>
+        <w:rPr>
+          <w:rFonts w:ascii="Tahoma" w:hAnsi="Tahoma" w:cs="Tahoma"/>
+          <w:sz w:val="20"/>
+          <w:szCs w:val="20"/>
+        </w:rPr>
+      </w:pPr>
+    </w:p>
+    <w:p>
+      <w:pPr>
+        <w:spacing w:after="0" w:line="240" w:lineRule="auto"/>
+        <w:rPr>
+          <w:rFonts w:ascii="Tahoma" w:hAnsi="Tahoma" w:cs="Tahoma"/>
+          <w:sz w:val="20"/>
+          <w:szCs w:val="20"/>
+        </w:rPr>
+      </w:pPr>
+    </w:p>
+    <w:p>
+      <w:pPr>
+        <w:spacing w:after="0" w:line="240" w:lineRule="auto"/>
+        <w:rPr>
+          <w:rFonts w:ascii="Tahoma" w:hAnsi="Tahoma" w:cs="Tahoma"/>
+          <w:sz w:val="20"/>
+          <w:szCs w:val="20"/>
+        </w:rPr>
+      </w:pPr>
+      <w:r>
+        <w:rPr>
+          <w:rFonts w:ascii="Tahoma" w:hAnsi="Tahoma" w:cs="Tahoma"/>
+          <w:b/>
+          <w:bCs/>
+          <w:sz w:val="20"/>
+          <w:szCs w:val="20"/>
+        </w:rPr>
+        <w:lastRenderedPageBreak/>
+        <w:t>SLIDER</w:t>
+      </w:r>
+    </w:p>
+    <w:p>
+      <w:pPr>
+        <w:spacing w:after="0" w:line="240" w:lineRule="auto"/>
+        <w:rPr>
+          <w:rFonts w:ascii="Tahoma" w:hAnsi="Tahoma" w:cs="Tahoma"/>
+          <w:sz w:val="20"/>
+          <w:szCs w:val="20"/>
+        </w:rPr>
+      </w:pPr>
+      <w:r>
+        <w:rPr>
+          <w:rFonts w:ascii="Tahoma" w:hAnsi="Tahoma" w:cs="Tahoma"/>
+          <w:sz w:val="20"/>
+          <w:szCs w:val="20"/>
+        </w:rPr>
+        <w:drawing>
+          <wp:inline distT="0" distB="0" distL="0" distR="0" wp14:anchorId="5CE889E2" wp14:editId="442DF724">
+            <wp:extent cx="4191585" cy="1790950"/>
+            <wp:effectExtent l="0" t="0" r="0" b="0"/>
+            <wp:docPr id="2109228331" name="Picture 1" descr="A screenshot of a computer&#10;&#10;AI-generated content may be incorrect."/>
+            <wp:cNvGraphicFramePr>
+              <a:graphicFrameLocks xmlns:a="http://schemas.openxmlformats.org/drawingml/2006/main" noChangeAspect="1"/>
+            </wp:cNvGraphicFramePr>
+            <a:graphic xmlns:a="http://schemas.openxmlformats.org/drawingml/2006/main">
+              <a:graphicData uri="http://schemas.openxmlformats.org/drawingml/2006/picture">
+                <pic:pic xmlns:pic="http://schemas.openxmlformats.org/drawingml/2006/picture">
+                  <pic:nvPicPr>
+                    <pic:cNvPr id="2109228331" name="Picture 1" descr="A screenshot of a computer&#10;&#10;AI-generated content may be incorrect."/>
+                    <pic:cNvPicPr/>
+                  </pic:nvPicPr>
+                  <pic:blipFill>
+                    <a:blip r:embed="rId8"/>
+                    <a:stretch>
+                      <a:fillRect/>
+                    </a:stretch>
+                  </pic:blipFill>
+                  <pic:spPr>
+                    <a:xfrm>
+                      <a:off x="0" y="0"/>
+                      <a:ext cx="4191585" cy="1790950"/>
+                    </a:xfrm>
+                    <a:prstGeom prst="rect">
+                      <a:avLst/>
+                    </a:prstGeom>
+                  </pic:spPr>
+                </pic:pic>
+              </a:graphicData>
+            </a:graphic>
+          </wp:inline>
+        </w:drawing>
+      </w:r>
+    </w:p>
+    <w:p>
+      <w:pPr>
+        <w:spacing w:after="0" w:line="240" w:lineRule="auto"/>
+        <w:rPr>
+          <w:rFonts w:ascii="Tahoma" w:hAnsi="Tahoma" w:cs="Tahoma"/>
+          <w:sz w:val="20"/>
+          <w:szCs w:val="20"/>
+        </w:rPr>
+      </w:pPr>
+      <w:r>
+        <w:rPr>
+          <w:rFonts w:ascii="Tahoma" w:hAnsi="Tahoma" w:cs="Tahoma"/>
+          <w:noProof/>
+          <w:sz w:val="20"/>
+          <w:szCs w:val="20"/>
+        </w:rPr>
+        <mc:AlternateContent>
+          <mc:Choice Requires="wpi">
+            <w:drawing>
+              <wp:anchor distT="0" distB="0" distL="114300" distR="114300" simplePos="0" relativeHeight="251661312" behindDoc="0" locked="0" layoutInCell="1" allowOverlap="1" wp14:anchorId="5B13FC9F" wp14:editId="6B155DE4">
+                <wp:simplePos x="0" y="0"/>
+                <wp:positionH relativeFrom="column">
+                  <wp:posOffset>1660620</wp:posOffset>
+                </wp:positionH>
+                <wp:positionV relativeFrom="paragraph">
+                  <wp:posOffset>417565</wp:posOffset>
+                </wp:positionV>
+                <wp:extent cx="601560" cy="92520"/>
+                <wp:effectExtent l="57150" t="76200" r="65405" b="79375"/>
+                <wp:wrapNone/>
+                <wp:docPr id="2048257702" name="Ink 3"/>
+                <wp:cNvGraphicFramePr/>
+                <a:graphic xmlns:a="http://schemas.openxmlformats.org/drawingml/2006/main">
+                  <a:graphicData uri="http://schemas.microsoft.com/office/word/2010/wordprocessingInk">
+                    <w14:contentPart bwMode="auto" r:id="rId9">
+                      <w14:nvContentPartPr>
+                        <w14:cNvContentPartPr/>
+                      </w14:nvContentPartPr>
+                      <w14:xfrm>
+                        <a:off x="0" y="0"/>
+                        <a:ext cx="601560" cy="92520"/>
+                      </w14:xfrm>
+                    </w14:contentPart>
+                  </a:graphicData>
+                </a:graphic>
+              </wp:anchor>
+            </w:drawing>
+          </mc:Choice>
+          <mc:Fallback>
+            <w:pict>
+              <v:shapetype w14:anchorId="22B7CA37" id="_x0000_t75" coordsize="21600,21600" o:spt="75" o:preferrelative="t" path="m@4@5l@4@11@9@11@9@5xe" filled="f" stroked="f">
+                <v:stroke joinstyle="miter"/>
+                <v:formulas>
+                  <v:f eqn="if lineDrawn pixelLineWidth 0"/>
+                  <v:f eqn="sum @0 1 0"/>
+                  <v:f eqn="sum 0 0 @1"/>
+                  <v:f eqn="prod @2 1 2"/>
+                  <v:f eqn="prod @3 21600 pixelWidth"/>
+                  <v:f eqn="prod @3 21600 pixelHeight"/>
+                  <v:f eqn="sum @0 0 1"/>
+                  <v:f eqn="prod @6 1 2"/>
+                  <v:f eqn="prod @7 21600 pixelWidth"/>
+                  <v:f eqn="sum @8 21600 0"/>
+                  <v:f eqn="prod @7 21600 pixelHeight"/>
+                  <v:f eqn="sum @10 21600 0"/>
+                </v:formulas>
+                <v:path o:extrusionok="f" gradientshapeok="t" o:connecttype="rect"/>
+                <o:lock v:ext="edit" aspectratio="t"/>
+              </v:shapetype>
+              <v:shape id="Ink 3" o:spid="_x0000_s1026" type="#_x0000_t75" style="position:absolute;margin-left:129.35pt;margin-top:30.1pt;width:50.15pt;height:13pt;z-index:251661312;visibility:visible;mso-wrap-style:square;mso-wrap-distance-left:9pt;mso-wrap-distance-top:0;mso-wrap-distance-right:9pt;mso-wrap-distance-bottom:0;mso-position-horizontal:absolute;mso-position-horizontal-relative:text;mso-position-vertical:absolute;mso-position-vertical-relative:text" o:gfxdata="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">
+                <v:imagedata r:id="rId10" o:title=""/>
+              </v:shape>
+            </w:pict>
+          </mc:Fallback>
+        </mc:AlternateContent>
+      </w:r>
+      <w:r>
+        <w:rPr>
+          <w:rFonts w:ascii="Tahoma" w:hAnsi="Tahoma" w:cs="Tahoma"/>
+          <w:noProof/>
+          <w:sz w:val="20"/>
+          <w:szCs w:val="20"/>
+        </w:rPr>
+        <mc:AlternateContent>
+          <mc:Choice Requires="wpi">
+            <w:drawing>
+              <wp:anchor distT="0" distB="0" distL="114300" distR="114300" simplePos="0" relativeHeight="251659264" behindDoc="0" locked="0" layoutInCell="1" allowOverlap="1" wp14:anchorId="0CA885AF" wp14:editId="51EB26CB">
+                <wp:simplePos x="0" y="0"/>
+                <wp:positionH relativeFrom="column">
+                  <wp:posOffset>1623900</wp:posOffset>
+                </wp:positionH>
+                <wp:positionV relativeFrom="paragraph">
+                  <wp:posOffset>1293805</wp:posOffset>
+                </wp:positionV>
+                <wp:extent cx="665280" cy="133560"/>
+                <wp:effectExtent l="57150" t="76200" r="59055" b="76200"/>
+                <wp:wrapNone/>
+                <wp:docPr id="329386678" name="Ink 1"/>
+                <wp:cNvGraphicFramePr/>
+                <a:graphic xmlns:a="http://schemas.openxmlformats.org/drawingml/2006/main">
+                  <a:graphicData uri="http://schemas.microsoft.com/office/word/2010/wordprocessingInk">
+                    <w14:contentPart bwMode="auto" r:id="rId11">
+                      <w14:nvContentPartPr>
+                        <w14:cNvContentPartPr/>
+                      </w14:nvContentPartPr>
+                      <w14:xfrm>
+                        <a:off x="0" y="0"/>
+                        <a:ext cx="665280" cy="133560"/>
+                      </w14:xfrm>
+                    </w14:contentPart>
+                  </a:graphicData>
+                </a:graphic>
+              </wp:anchor>
+            </w:drawing>
+          </mc:Choice>
+          <mc:Fallback>
+            <w:pict>
+              <v:shape w14:anchorId="0F415F2D" id="Ink 1" o:spid="_x0000_s1026" type="#_x0000_t75" style="position:absolute;margin-left:126.45pt;margin-top:99.05pt;width:55.25pt;height:16.15pt;z-index:251659264;visibility:visible;mso-wrap-style:square;mso-wrap-distance-left:9pt;mso-wrap-distance-top:0;mso-wrap-distance-right:9pt;mso-wrap-distance-bottom:0;mso-position-horizontal:absolute;mso-position-horizontal-relative:text;mso-position-vertical:absolute;mso-position-vertical-relative:text" o:gfxdata="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">
+                <v:imagedata r:id="rId12" o:title=""/>
+              </v:shape>
+            </w:pict>
+          </mc:Fallback>
+        </mc:AlternateContent>
+      </w:r>
+      <w:r>
+        <w:rPr>
+          <w:rFonts w:ascii="Tahoma" w:hAnsi="Tahoma" w:cs="Tahoma"/>
+          <w:sz w:val="20"/>
+          <w:szCs w:val="20"/>
+        </w:rPr>
+        <w:drawing>
+          <wp:inline distT="0" distB="0" distL="0" distR="0" wp14:anchorId="051258CD" wp14:editId="1719EE20">
+            <wp:extent cx="5731510" cy="2566670"/>
+            <wp:effectExtent l="0" t="0" r="2540" b="5080"/>
+            <wp:docPr id="123929168" name="Picture 1" descr="A computer screen shot of a program&#10;&#10;AI-generated content may be incorrect."/>
+            <wp:cNvGraphicFramePr>
+              <a:graphicFrameLocks xmlns:a="http://schemas.openxmlformats.org/drawingml/2006/main" noChangeAspect="1"/>
+            </wp:cNvGraphicFramePr>
+            <a:graphic xmlns:a="http://schemas.openxmlformats.org/drawingml/2006/main">
+              <a:graphicData uri="http://schemas.openxmlformats.org/drawingml/2006/picture">
+                <pic:pic xmlns:pic="http://schemas.openxmlformats.org/drawingml/2006/picture">
+                  <pic:nvPicPr>
+                    <pic:cNvPr id="123929168" name="Picture 1" descr="A computer screen shot of a program&#10;&#10;AI-generated content may be incorrect."/>
+                    <pic:cNvPicPr/>
+                  </pic:nvPicPr>
+                  <pic:blipFill>
+                    <a:blip r:embed="rId13"/>
+                    <a:stretch>
+                      <a:fillRect/>
+                    </a:stretch>
+                  </pic:blipFill>
+                  <pic:spPr>
+                    <a:xfrm>
+                      <a:off x="0" y="0"/>
+                      <a:ext cx="5731510" cy="2566670"/>
+                    </a:xfrm>
+                    <a:prstGeom prst="rect">
+                      <a:avLst/>
+                    </a:prstGeom>
+                  </pic:spPr>
+                </pic:pic>
+              </a:graphicData>
+            </a:graphic>
+          </wp:inline>
+        </w:drawing>
+      </w:r>
+    </w:p>
+    <w:p>
+      <w:pPr>
+        <w:spacing w:after="0" w:line="240" w:lineRule="auto"/>
+        <w:rPr>
+          <w:rFonts w:ascii="Tahoma" w:hAnsi="Tahoma" w:cs="Tahoma"/>
+          <w:sz w:val="20"/>
+          <w:szCs w:val="20"/>
+        </w:rPr>
+      </w:pPr>
+      <w:r>
+        <w:rPr>
+          <w:rFonts w:ascii="Tahoma" w:hAnsi="Tahoma" w:cs="Tahoma"/>
+          <w:noProof/>
+          <w:sz w:val="20"/>
+          <w:szCs w:val="20"/>
+        </w:rPr>
+        <mc:AlternateContent>
+          <mc:Choice Requires="wpi">
+            <w:drawing>
+              <wp:anchor distT="0" distB="0" distL="114300" distR="114300" simplePos="0" relativeHeight="251662336" behindDoc="0" locked="0" layoutInCell="1" allowOverlap="1" wp14:anchorId="67FBCE75" wp14:editId="58E3956E">
+                <wp:simplePos x="0" y="0"/>
+                <wp:positionH relativeFrom="column">
+                  <wp:posOffset>822540</wp:posOffset>
+                </wp:positionH>
+                <wp:positionV relativeFrom="paragraph">
+                  <wp:posOffset>48655</wp:posOffset>
+                </wp:positionV>
+                <wp:extent cx="444240" cy="61560"/>
+                <wp:effectExtent l="57150" t="76200" r="70485" b="91440"/>
+                <wp:wrapNone/>
+                <wp:docPr id="1144121119" name="Ink 4"/>
+                <wp:cNvGraphicFramePr/>
+                <a:graphic xmlns:a="http://schemas.openxmlformats.org/drawingml/2006/main">
+                  <a:graphicData uri="http://schemas.microsoft.com/office/word/2010/wordprocessingInk">
+                    <w14:contentPart bwMode="auto" r:id="rId14">
+                      <w14:nvContentPartPr>
+                        <w14:cNvContentPartPr/>
+                      </w14:nvContentPartPr>
+                      <w14:xfrm>
+                        <a:off x="0" y="0"/>
+                        <a:ext cx="444240" cy="61560"/>
+                      </w14:xfrm>
+                    </w14:contentPart>
+                  </a:graphicData>
+                </a:graphic>
+              </wp:anchor>
+            </w:drawing>
+          </mc:Choice>
+          <mc:Fallback>
+            <w:pict>
+              <v:shape w14:anchorId="35314155" id="Ink 4" o:spid="_x0000_s1026" type="#_x0000_t75" style="position:absolute;margin-left:63.35pt;margin-top:1pt;width:37.85pt;height:10.55pt;z-index:251662336;visibility:visible;mso-wrap-style:square;mso-wrap-distance-left:9pt;mso-wrap-distance-top:0;mso-wrap-distance-right:9pt;mso-wrap-distance-bottom:0;mso-position-horizontal:absolute;mso-position-horizontal-relative:text;mso-position-vertical:absolute;mso-position-vertical-relative:text" o:gfxdata="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">
+                <v:imagedata r:id="rId15" o:title=""/>
+              </v:shape>
+            </w:pict>
+          </mc:Fallback>
+        </mc:AlternateContent>
+      </w:r>
+      <w:r>
+        <w:rPr>
+          <w:rFonts w:ascii="Tahoma" w:hAnsi="Tahoma" w:cs="Tahoma"/>
+          <w:sz w:val="20"/>
+          <w:szCs w:val="20"/>
+        </w:rPr>
+        <w:t xml:space="preserve">Take note that </w:t>
+      </w:r>
+      <w:proofErr w:type="spellStart"/>
+      <w:r>
+        <w:rPr>
+          <w:rFonts w:ascii="Tahoma" w:hAnsi="Tahoma" w:cs="Tahoma"/>
+          <w:sz w:val="20"/>
+          <w:szCs w:val="20"/>
+        </w:rPr>
+        <w:t>InputId</w:t>
+      </w:r>
+      <w:proofErr w:type="spellEnd"/>
+      <w:r>
+        <w:rPr>
+          <w:rFonts w:ascii="Tahoma" w:hAnsi="Tahoma" w:cs="Tahoma"/>
+          <w:sz w:val="20"/>
+          <w:szCs w:val="20"/>
+        </w:rPr>
+        <w:t xml:space="preserve"> </w:t>
+      </w:r>
+      <w:r>
+        <w:rPr>
+          <w:rFonts w:ascii="Tahoma" w:hAnsi="Tahoma" w:cs="Tahoma"/>
+          <w:sz w:val="20"/>
+          <w:szCs w:val="20"/>
+          <w:u w:val="single"/>
+        </w:rPr>
+        <w:t>MUST BE UNIQUE</w:t>
+      </w:r>
+      <w:r>
+        <w:rPr>
+          <w:rFonts w:ascii="Tahoma" w:hAnsi="Tahoma" w:cs="Tahoma"/>
+          <w:sz w:val="20"/>
+          <w:szCs w:val="20"/>
+        </w:rPr>
+        <w:t xml:space="preserve"> as there can be multiple sliders in the interface</w:t>
+      </w:r>
+    </w:p>
+    <w:p>
+      <w:pPr>
+        <w:spacing w:after="0" w:line="240" w:lineRule="auto"/>
+        <w:rPr>
+          <w:rFonts w:ascii="Tahoma" w:hAnsi="Tahoma" w:cs="Tahoma"/>
+          <w:sz w:val="20"/>
+          <w:szCs w:val="20"/>
+        </w:rPr>
+      </w:pPr>
+      <w:r>
+        <w:rPr>
+          <w:rFonts w:ascii="Tahoma" w:hAnsi="Tahoma" w:cs="Tahoma"/>
+          <w:i/>
+          <w:iCs/>
+          <w:noProof/>
+          <w:sz w:val="20"/>
+          <w:szCs w:val="20"/>
+        </w:rPr>
+        <mc:AlternateContent>
+          <mc:Choice Requires="wpi">
+            <w:drawing>
+              <wp:anchor distT="0" distB="0" distL="114300" distR="114300" simplePos="0" relativeHeight="251660288" behindDoc="0" locked="0" layoutInCell="1" allowOverlap="1" wp14:anchorId="503B18FF" wp14:editId="60656697">
+                <wp:simplePos x="0" y="0"/>
+                <wp:positionH relativeFrom="column">
+                  <wp:posOffset>-43620</wp:posOffset>
+                </wp:positionH>
+                <wp:positionV relativeFrom="paragraph">
+                  <wp:posOffset>61305</wp:posOffset>
+                </wp:positionV>
+                <wp:extent cx="552600" cy="72360"/>
+                <wp:effectExtent l="57150" t="76200" r="38100" b="80645"/>
+                <wp:wrapNone/>
+                <wp:docPr id="1921794433" name="Ink 2"/>
+                <wp:cNvGraphicFramePr/>
+                <a:graphic xmlns:a="http://schemas.openxmlformats.org/drawingml/2006/main">
+                  <a:graphicData uri="http://schemas.microsoft.com/office/word/2010/wordprocessingInk">
+                    <w14:contentPart bwMode="auto" r:id="rId16">
+                      <w14:nvContentPartPr>
+                        <w14:cNvContentPartPr/>
+                      </w14:nvContentPartPr>
+                      <w14:xfrm>
+                        <a:off x="0" y="0"/>
+                        <a:ext cx="552600" cy="72360"/>
+                      </w14:xfrm>
+                    </w14:contentPart>
+                  </a:graphicData>
+                </a:graphic>
+              </wp:anchor>
+            </w:drawing>
+          </mc:Choice>
+          <mc:Fallback>
+            <w:pict>
+              <v:shape w14:anchorId="3155ABBE" id="Ink 2" o:spid="_x0000_s1026" type="#_x0000_t75" style="position:absolute;margin-left:-4.85pt;margin-top:2.05pt;width:46.3pt;height:11.4pt;z-index:251660288;visibility:visible;mso-wrap-style:square;mso-wrap-distance-left:9pt;mso-wrap-distance-top:0;mso-wrap-distance-right:9pt;mso-wrap-distance-bottom:0;mso-position-horizontal:absolute;mso-position-horizontal-relative:text;mso-position-vertical:absolute;mso-position-vertical-relative:text" o:gfxdata="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">
+                <v:imagedata r:id="rId17" o:title=""/>
+              </v:shape>
+            </w:pict>
+          </mc:Fallback>
+        </mc:AlternateContent>
+      </w:r>
+      <w:r>
+        <w:rPr>
+          <w:rFonts w:ascii="Tahoma" w:hAnsi="Tahoma" w:cs="Tahoma"/>
+          <w:i/>
+          <w:iCs/>
+          <w:sz w:val="20"/>
+          <w:szCs w:val="20"/>
+        </w:rPr>
+        <w:t>selected</w:t>
+      </w:r>
+      <w:r>
+        <w:rPr>
+          <w:rFonts w:ascii="Tahoma" w:hAnsi="Tahoma" w:cs="Tahoma"/>
+          <w:sz w:val="20"/>
+          <w:szCs w:val="20"/>
+        </w:rPr>
+        <w:t xml:space="preserve"> just controls what is the default value</w:t>
+      </w:r>
+    </w:p>
+    <w:p>
+      <w:pPr>
+        <w:spacing w:after="0" w:line="240" w:lineRule="auto"/>
+        <w:rPr>
+          <w:rFonts w:ascii="Tahoma" w:hAnsi="Tahoma" w:cs="Tahoma"/>
+          <w:sz w:val="20"/>
+          <w:szCs w:val="20"/>
+        </w:rPr>
+      </w:pPr>
+    </w:p>
+    <w:p>
+      <w:pPr>
+        <w:spacing w:after="0" w:line="240" w:lineRule="auto"/>
+        <w:rPr>
+          <w:rFonts w:ascii="Tahoma" w:hAnsi="Tahoma" w:cs="Tahoma"/>
+          <w:sz w:val="20"/>
+          <w:szCs w:val="20"/>
+        </w:rPr>
+      </w:pPr>
+      <w:r>
+        <w:rPr>
+          <w:rFonts w:ascii="Tahoma" w:hAnsi="Tahoma" w:cs="Tahoma"/>
+          <w:sz w:val="20"/>
+          <w:szCs w:val="20"/>
+        </w:rPr>
+        <w:drawing>
+          <wp:inline distT="0" distB="0" distL="0" distR="0" wp14:anchorId="4FB37767" wp14:editId="6AFAF273">
+            <wp:extent cx="5731510" cy="1872615"/>
+            <wp:effectExtent l="0" t="0" r="2540" b="0"/>
+            <wp:docPr id="1873236068" name="Picture 1" descr="A screenshot of a computer&#10;&#10;AI-generated content may be incorrect."/>
+            <wp:cNvGraphicFramePr>
+              <a:graphicFrameLocks xmlns:a="http://schemas.openxmlformats.org/drawingml/2006/main" noChangeAspect="1"/>
+            </wp:cNvGraphicFramePr>
+            <a:graphic xmlns:a="http://schemas.openxmlformats.org/drawingml/2006/main">
+              <a:graphicData uri="http://schemas.openxmlformats.org/drawingml/2006/picture">
+                <pic:pic xmlns:pic="http://schemas.openxmlformats.org/drawingml/2006/picture">
+                  <pic:nvPicPr>
+                    <pic:cNvPr id="1873236068" name="Picture 1" descr="A screenshot of a computer&#10;&#10;AI-generated content may be incorrect."/>
+                    <pic:cNvPicPr/>
+                  </pic:nvPicPr>
+                  <pic:blipFill>
+                    <a:blip r:embed="rId18"/>
+                    <a:stretch>
+                      <a:fillRect/>
+                    </a:stretch>
+                  </pic:blipFill>
+                  <pic:spPr>
+                    <a:xfrm>
+                      <a:off x="0" y="0"/>
+                      <a:ext cx="5731510" cy="1872615"/>
+                    </a:xfrm>
+                    <a:prstGeom prst="rect">
+                      <a:avLst/>
+                    </a:prstGeom>
+                  </pic:spPr>
+                </pic:pic>
+              </a:graphicData>
+            </a:graphic>
+          </wp:inline>
+        </w:drawing>
+      </w:r>
+    </w:p>
+    <w:p>
+      <w:pPr>
+        <w:spacing w:after="0" w:line="240" w:lineRule="auto"/>
+        <w:rPr>
+          <w:rFonts w:ascii="Tahoma" w:hAnsi="Tahoma" w:cs="Tahoma"/>
+          <w:sz w:val="20"/>
+          <w:szCs w:val="20"/>
+        </w:rPr>
+      </w:pPr>
+      <w:r>
+        <w:rPr>
+          <w:rFonts w:ascii="Tahoma" w:hAnsi="Tahoma" w:cs="Tahoma"/>
+          <w:sz w:val="20"/>
+          <w:szCs w:val="20"/>
+        </w:rPr>
+        <w:t xml:space="preserve">Inserted under </w:t>
+      </w:r>
+      <w:proofErr w:type="spellStart"/>
+      <w:r>
+        <w:rPr>
+          <w:rFonts w:ascii="Tahoma" w:hAnsi="Tahoma" w:cs="Tahoma"/>
+          <w:i/>
+          <w:iCs/>
+          <w:sz w:val="20"/>
+          <w:szCs w:val="20"/>
+        </w:rPr>
+        <w:t>mainPanel</w:t>
+      </w:r>
+      <w:proofErr w:type="spellEnd"/>
+      <w:r>
+        <w:rPr>
+          <w:rFonts w:ascii="Tahoma" w:hAnsi="Tahoma" w:cs="Tahoma"/>
+          <w:i/>
+          <w:iCs/>
+          <w:sz w:val="20"/>
+          <w:szCs w:val="20"/>
+        </w:rPr>
+        <w:t>()</w:t>
+      </w:r>
+      <w:r>
+        <w:rPr>
+          <w:rFonts w:ascii="Tahoma" w:hAnsi="Tahoma" w:cs="Tahoma"/>
+          <w:sz w:val="20"/>
+          <w:szCs w:val="20"/>
+        </w:rPr>
+        <w:t>, needs to have a unique ID also</w:t>
+      </w:r>
+    </w:p>
+    <w:p>
+      <w:pPr>
+        <w:spacing w:after="0" w:line="240" w:lineRule="auto"/>
+        <w:rPr>
+          <w:rFonts w:ascii="Tahoma" w:hAnsi="Tahoma" w:cs="Tahoma"/>
+          <w:sz w:val="20"/>
+          <w:szCs w:val="20"/>
+        </w:rPr>
+      </w:pPr>
+    </w:p>
+    <w:p>
+      <w:pPr>
+        <w:spacing w:after="0" w:line="240" w:lineRule="auto"/>
+        <w:rPr>
+          <w:rFonts w:ascii="Tahoma" w:hAnsi="Tahoma" w:cs="Tahoma"/>
+          <w:sz w:val="20"/>
+          <w:szCs w:val="20"/>
+        </w:rPr>
+      </w:pPr>
+      <w:r>
+        <w:rPr>
+          <w:rFonts w:ascii="Tahoma" w:hAnsi="Tahoma" w:cs="Tahoma"/>
+          <w:sz w:val="20"/>
+          <w:szCs w:val="20"/>
+        </w:rPr>
+        <w:drawing>
+          <wp:inline distT="0" distB="0" distL="0" distR="0" wp14:anchorId="768EC91A" wp14:editId="0E922BA0">
+            <wp:extent cx="3352800" cy="1435694"/>
+            <wp:effectExtent l="0" t="0" r="0" b="0"/>
+            <wp:docPr id="24367556" name="Picture 8" descr="A screenshot of a computer code&#10;&#10;AI-generated content may be incorrect."/>
+            <wp:cNvGraphicFramePr>
+              <a:graphicFrameLocks xmlns:a="http://schemas.openxmlformats.org/drawingml/2006/main" noChangeAspect="1"/>
+            </wp:cNvGraphicFramePr>
+            <a:graphic xmlns:a="http://schemas.openxmlformats.org/drawingml/2006/main">
+              <a:graphicData uri="http://schemas.openxmlformats.org/drawingml/2006/picture">
+                <pic:pic xmlns:pic="http://schemas.openxmlformats.org/drawingml/2006/picture">
+                  <pic:nvPicPr>
+                    <pic:cNvPr id="24367556" name="Picture 8" descr="A screenshot of a computer code&#10;&#10;AI-generated content may be incorrect."/>
+                    <pic:cNvPicPr>
+                      <a:picLocks noChangeAspect="1" noChangeArrowheads="1"/>
+                    </pic:cNvPicPr>
+                  </pic:nvPicPr>
+                  <pic:blipFill>
+                    <a:blip r:embed="rId19">
+                      <a:extLst>
+                        <a:ext uri="{28A0092B-C50C-407E-A947-70E740481C1C}">
+                          <a14:useLocalDpi xmlns:a14="http://schemas.microsoft.com/office/drawing/2010/main" val="0"/>
+                        </a:ext>
+                      </a:extLst>
+                    </a:blip>
+                    <a:srcRect/>
+                    <a:stretch>
+                      <a:fillRect/>
+                    </a:stretch>
+                  </pic:blipFill>
+                  <pic:spPr bwMode="auto">
+                    <a:xfrm>
+                      <a:off x="0" y="0"/>
+                      <a:ext cx="3379882" cy="1447291"/>
+                    </a:xfrm>
+                    <a:prstGeom prst="rect">
+                      <a:avLst/>
+                    </a:prstGeom>
+                    <a:noFill/>
+                    <a:ln>
+                      <a:noFill/>
+                    </a:ln>
+                  </pic:spPr>
+                </pic:pic>
+              </a:graphicData>
+            </a:graphic>
+          </wp:inline>
+        </w:drawing>
+      </w:r>
+    </w:p>
+    <w:p>
+      <w:pPr>
+        <w:spacing w:after="0" w:line="240" w:lineRule="auto"/>
+        <w:rPr>
+          <w:rFonts w:ascii="Tahoma" w:hAnsi="Tahoma" w:cs="Tahoma"/>
+          <w:sz w:val="20"/>
+          <w:szCs w:val="20"/>
+        </w:rPr>
+      </w:pPr>
+    </w:p>
+    <w:p>
+      <w:pPr>
+        <w:spacing w:after="0" w:line="240" w:lineRule="auto"/>
+        <w:rPr>
+          <w:rFonts w:ascii="Tahoma" w:hAnsi="Tahoma" w:cs="Tahoma"/>
+          <w:sz w:val="20"/>
+          <w:szCs w:val="20"/>
+        </w:rPr>
+      </w:pPr>
+      <w:r>
+        <w:rPr>
+          <w:rFonts w:ascii="Tahoma" w:hAnsi="Tahoma" w:cs="Tahoma"/>
+          <w:sz w:val="20"/>
+          <w:szCs w:val="20"/>
+        </w:rPr>
+        <w:lastRenderedPageBreak/>
+        <w:drawing>
+          <wp:inline distT="0" distB="0" distL="0" distR="0" wp14:anchorId="201010FA" wp14:editId="027F59F3">
+            <wp:extent cx="5731510" cy="3252470"/>
+            <wp:effectExtent l="0" t="0" r="2540" b="5080"/>
+            <wp:docPr id="669267218" name="Picture 6" descr="A screenshot of a computer program&#10;&#10;AI-generated content may be incorrect."/>
+            <wp:cNvGraphicFramePr>
+              <a:graphicFrameLocks xmlns:a="http://schemas.openxmlformats.org/drawingml/2006/main" noChangeAspect="1"/>
+            </wp:cNvGraphicFramePr>
+            <a:graphic xmlns:a="http://schemas.openxmlformats.org/drawingml/2006/main">
+              <a:graphicData uri="http://schemas.openxmlformats.org/drawingml/2006/picture">
+                <pic:pic xmlns:pic="http://schemas.openxmlformats.org/drawingml/2006/picture">
+                  <pic:nvPicPr>
+                    <pic:cNvPr id="669267218" name="Picture 6" descr="A screenshot of a computer program&#10;&#10;AI-generated content may be incorrect."/>
+                    <pic:cNvPicPr>
+                      <a:picLocks noChangeAspect="1" noChangeArrowheads="1"/>
+                    </pic:cNvPicPr>
+                  </pic:nvPicPr>
+                  <pic:blipFill>
+                    <a:blip r:embed="rId20">
+                      <a:extLst>
+                        <a:ext uri="{28A0092B-C50C-407E-A947-70E740481C1C}">
+                          <a14:useLocalDpi xmlns:a14="http://schemas.microsoft.com/office/drawing/2010/main" val="0"/>
+                        </a:ext>
+                      </a:extLst>
+                    </a:blip>
+                    <a:srcRect/>
+                    <a:stretch>
+                      <a:fillRect/>
+                    </a:stretch>
+                  </pic:blipFill>
+                  <pic:spPr bwMode="auto">
+                    <a:xfrm>
+                      <a:off x="0" y="0"/>
+                      <a:ext cx="5731510" cy="3252470"/>
+                    </a:xfrm>
+                    <a:prstGeom prst="rect">
+                      <a:avLst/>
+                    </a:prstGeom>
+                    <a:noFill/>
+                    <a:ln>
+                      <a:noFill/>
+                    </a:ln>
+                  </pic:spPr>
+                </pic:pic>
+              </a:graphicData>
+            </a:graphic>
+          </wp:inline>
+        </w:drawing>
+      </w:r>
+    </w:p>
+    <w:p>
+      <w:pPr>
+        <w:spacing w:after="0" w:line="240" w:lineRule="auto"/>
+        <w:rPr>
+          <w:rFonts w:ascii="Tahoma" w:hAnsi="Tahoma" w:cs="Tahoma"/>
+          <w:sz w:val="20"/>
+          <w:szCs w:val="20"/>
+        </w:rPr>
+      </w:pPr>
+    </w:p>
+    <w:p>
+      <w:pPr>
+        <w:spacing w:after="0" w:line="240" w:lineRule="auto"/>
+        <w:rPr>
+          <w:rFonts w:ascii="Tahoma" w:hAnsi="Tahoma" w:cs="Tahoma"/>
+          <w:sz w:val="20"/>
+          <w:szCs w:val="20"/>
+        </w:rPr>
+      </w:pPr>
+      <w:r>
+        <w:rPr>
+          <w:rFonts w:ascii="Tahoma" w:hAnsi="Tahoma" w:cs="Tahoma"/>
+          <w:sz w:val="20"/>
+          <w:szCs w:val="20"/>
+        </w:rPr>
+        <w:drawing>
+          <wp:inline distT="0" distB="0" distL="0" distR="0" wp14:anchorId="3E7BBFEA" wp14:editId="23EB6A28">
+            <wp:extent cx="5731510" cy="1109345"/>
+            <wp:effectExtent l="0" t="0" r="2540" b="0"/>
+            <wp:docPr id="594522355" name="Picture 1" descr="A screen shot of a computer code&#10;&#10;AI-generated content may be incorrect."/>
+            <wp:cNvGraphicFramePr>
+              <a:graphicFrameLocks xmlns:a="http://schemas.openxmlformats.org/drawingml/2006/main" noChangeAspect="1"/>
+            </wp:cNvGraphicFramePr>
+            <a:graphic xmlns:a="http://schemas.openxmlformats.org/drawingml/2006/main">
+              <a:graphicData uri="http://schemas.openxmlformats.org/drawingml/2006/picture">
+                <pic:pic xmlns:pic="http://schemas.openxmlformats.org/drawingml/2006/picture">
+                  <pic:nvPicPr>
+                    <pic:cNvPr id="594522355" name="Picture 1" descr="A screen shot of a computer code&#10;&#10;AI-generated content may be incorrect."/>
+                    <pic:cNvPicPr/>
+                  </pic:nvPicPr>
+                  <pic:blipFill>
+                    <a:blip r:embed="rId21"/>
+                    <a:stretch>
+                      <a:fillRect/>
+                    </a:stretch>
+                  </pic:blipFill>
+                  <pic:spPr>
+                    <a:xfrm>
+                      <a:off x="0" y="0"/>
+                      <a:ext cx="5731510" cy="1109345"/>
+                    </a:xfrm>
+                    <a:prstGeom prst="rect">
+                      <a:avLst/>
+                    </a:prstGeom>
+                  </pic:spPr>
+                </pic:pic>
+              </a:graphicData>
+            </a:graphic>
+          </wp:inline>
+        </w:drawing>
+      </w:r>
+    </w:p>
+    <w:p>
+      <w:pPr>
+        <w:spacing w:after="0" w:line="240" w:lineRule="auto"/>
+      </w:pPr>
+      <w:r>
+        <w:rPr>
+          <w:rFonts w:ascii="Tahoma" w:hAnsi="Tahoma" w:cs="Tahoma"/>
+          <w:sz w:val="20"/>
+          <w:szCs w:val="20"/>
+        </w:rPr>
+        <w:t xml:space="preserve">Need to use </w:t>
+      </w:r>
+      <w:proofErr w:type="spellStart"/>
+      <w:r>
+        <w:rPr>
+          <w:rFonts w:ascii="Tahoma" w:hAnsi="Tahoma" w:cs="Tahoma"/>
+          <w:i/>
+          <w:iCs/>
+          <w:sz w:val="20"/>
+          <w:szCs w:val="20"/>
+        </w:rPr>
+        <w:t>aes_string</w:t>
+      </w:r>
+      <w:proofErr w:type="spellEnd"/>
+      <w:r>
+        <w:rPr>
+          <w:rFonts w:ascii="Tahoma" w:hAnsi="Tahoma" w:cs="Tahoma"/>
+          <w:i/>
+          <w:iCs/>
+          <w:sz w:val="20"/>
+          <w:szCs w:val="20"/>
+        </w:rPr>
+        <w:t xml:space="preserve">() </w:t>
+      </w:r>
+      <w:r>
+        <w:rPr>
+          <w:rFonts w:ascii="Tahoma" w:hAnsi="Tahoma" w:cs="Tahoma"/>
+          <w:sz w:val="20"/>
+          <w:szCs w:val="20"/>
+        </w:rPr>
+        <w:t xml:space="preserve">instead of </w:t>
+      </w:r>
+      <w:proofErr w:type="spellStart"/>
+      <w:r>
+        <w:rPr>
+          <w:rFonts w:ascii="Tahoma" w:hAnsi="Tahoma" w:cs="Tahoma"/>
+          <w:i/>
+          <w:iCs/>
+          <w:sz w:val="20"/>
+          <w:szCs w:val="20"/>
+        </w:rPr>
+        <w:t>aes</w:t>
+      </w:r>
+      <w:proofErr w:type="spellEnd"/>
+      <w:r>
+        <w:rPr>
+          <w:rFonts w:ascii="Tahoma" w:hAnsi="Tahoma" w:cs="Tahoma"/>
+          <w:i/>
+          <w:iCs/>
+          <w:sz w:val="20"/>
+          <w:szCs w:val="20"/>
+        </w:rPr>
+        <w:t>()</w:t>
+      </w:r>
+      <w:r>
+        <w:rPr>
+          <w:rFonts w:ascii="Tahoma" w:hAnsi="Tahoma" w:cs="Tahoma"/>
+          <w:sz w:val="20"/>
+          <w:szCs w:val="20"/>
+        </w:rPr>
+        <w:t xml:space="preserve"> because we want to read the value inside the variable that is chosen, not the variable as a word e.g. read value inside </w:t>
+      </w:r>
+      <w:r>
+        <w:rPr>
+          <w:rFonts w:ascii="Tahoma" w:hAnsi="Tahoma" w:cs="Tahoma"/>
+          <w:i/>
+          <w:iCs/>
+          <w:sz w:val="20"/>
+          <w:szCs w:val="20"/>
+        </w:rPr>
+        <w:t>ENGLISH</w:t>
+      </w:r>
+      <w:r>
+        <w:rPr>
+          <w:rFonts w:ascii="Tahoma" w:hAnsi="Tahoma" w:cs="Tahoma"/>
+          <w:sz w:val="20"/>
+          <w:szCs w:val="20"/>
+        </w:rPr>
+        <w:t xml:space="preserve"> (which is the score) instead of reading the word “ENGLISH”</w:t>
       </w:r>
     </w:p>
     <w:sectPr>
@@ -1423,6 +2268,122 @@
 </w:styles>
 </file>
 
+<file path=word/ink/ink1.xml><?xml version="1.0" encoding="utf-8"?>
+<inkml:ink xmlns:inkml="http://www.w3.org/2003/InkML">
+  <inkml:definitions>
+    <inkml:context xml:id="ctx0">
+      <inkml:inkSource xml:id="inkSrc0">
+        <inkml:traceFormat>
+          <inkml:channel name="X" type="integer" min="-2.14748E9" max="2.14748E9" units="cm"/>
+          <inkml:channel name="Y" type="integer" min="-2.14748E9" max="2.14748E9" units="cm"/>
+        </inkml:traceFormat>
+        <inkml:channelProperties>
+          <inkml:channelProperty channel="X" name="resolution" value="1000" units="1/cm"/>
+          <inkml:channelProperty channel="Y" name="resolution" value="1000" units="1/cm"/>
+        </inkml:channelProperties>
+      </inkml:inkSource>
+      <inkml:timestamp xml:id="ts0" timeString="2025-02-22T06:27:37.581"/>
+    </inkml:context>
+    <inkml:brush xml:id="br0">
+      <inkml:brushProperty name="width" value="0.1" units="cm"/>
+      <inkml:brushProperty name="height" value="0.2" units="cm"/>
+      <inkml:brushProperty name="color" value="#FFFC00"/>
+      <inkml:brushProperty name="tip" value="rectangle"/>
+      <inkml:brushProperty name="rasterOp" value="maskPen"/>
+      <inkml:brushProperty name="ignorePressure" value="1"/>
+    </inkml:brush>
+  </inkml:definitions>
+  <inkml:trace contextRef="#ctx0" brushRef="#br0">2 108,'73'-2,"-33"0,77 7,-98-1,38 12,-39-11,-1 0,1-1,23 3,81-3,-67-4,66 10,-16-1,16 3,-25 11,-68-15,0-2,1 0,56 3,44-12,91 5,-171 8,-42-8,0 0,0 0,0 0,1-1,-1 0,0-1,0 0,12-1,-19 1,0 0,0 0,0 0,1 0,-1 0,0 0,0 0,0 0,0 0,1 0,-1 0,0 0,0 0,0 0,0-1,0 1,1 0,-1 0,0 0,0 0,0 0,0 0,0-1,0 1,0 0,1 0,-1 0,0 0,0-1,0 1,0 0,0 0,0 0,0 0,0-1,0 1,0 0,0 0,0 0,0 0,0-1,-6-7,-12-6,0 4,0 0,-1 2,-35-12,-17-7,49 18,-1 1,0 1,0 1,-1 1,-43-3,-124 5,117 4,59 0,0 1,0 0,0 2,-27 8,24-6,-1-1,-32 5,-441 12,189-22,277-3,18-2,18-4,19 0,0 2,1 0,-1 2,1 1,30 1,-32 1,722-11,-451 16,-239-2,71-3,-124 1,1 0,-1-1,0 0,0 0,1-1,-2 0,1 0,0-1,-1 0,1 0,-1 0,0-1,-1 0,6-6,-10 10,0 1,-1-1,1 0,-1 1,1-1,-1 1,1-1,-1 0,1 1,-1-1,0 0,1 0,-1 1,0-1,0 0,1 0,-1 0,0 1,0-1,0 0,0 0,0 0,0 1,0-1,0 0,-1 0,1 0,0 1,0-1,-1-1,-1 0,1 1,-1-1,1 1,-1 0,0-1,1 1,-1 0,0 0,0 0,0 0,-4 0,-5-3,0 2,-1 0,-14-1,-265 1,142 4,-449-2,575 0,0 2,-36 6,51-7,-1 1,1 0,-1 1,1 0,0 1,0-1,0 2,1-1,-13 10,8-2</inkml:trace>
+</inkml:ink>
+</file>
+
+<file path=word/ink/ink2.xml><?xml version="1.0" encoding="utf-8"?>
+<inkml:ink xmlns:inkml="http://www.w3.org/2003/InkML">
+  <inkml:definitions>
+    <inkml:context xml:id="ctx0">
+      <inkml:inkSource xml:id="inkSrc0">
+        <inkml:traceFormat>
+          <inkml:channel name="X" type="integer" min="-2.14748E9" max="2.14748E9" units="cm"/>
+          <inkml:channel name="Y" type="integer" min="-2.14748E9" max="2.14748E9" units="cm"/>
+        </inkml:traceFormat>
+        <inkml:channelProperties>
+          <inkml:channelProperty channel="X" name="resolution" value="1000" units="1/cm"/>
+          <inkml:channelProperty channel="Y" name="resolution" value="1000" units="1/cm"/>
+        </inkml:channelProperties>
+      </inkml:inkSource>
+      <inkml:timestamp xml:id="ts0" timeString="2025-02-22T06:27:29.288"/>
+    </inkml:context>
+    <inkml:brush xml:id="br0">
+      <inkml:brushProperty name="width" value="0.1" units="cm"/>
+      <inkml:brushProperty name="height" value="0.2" units="cm"/>
+      <inkml:brushProperty name="color" value="#FFFC00"/>
+      <inkml:brushProperty name="tip" value="rectangle"/>
+      <inkml:brushProperty name="rasterOp" value="maskPen"/>
+      <inkml:brushProperty name="ignorePressure" value="1"/>
+    </inkml:brush>
+  </inkml:definitions>
+  <inkml:trace contextRef="#ctx0" brushRef="#br0">40 109,'56'0,"-10"2,0-3,91-13,-97 7,-18 3,41-11,-33 6,0 2,0 2,62-4,-2 1,67-2,9-1,-82 3,164 6,-120 4,-50-3,87 3,-158-2,0 1,0 1,0-1,-1 1,1 1,0-1,-1 1,0 0,0 0,0 1,0 0,0 0,7 7,-13-10,1-1,-1 0,0 1,0-1,1 1,-1-1,0 0,0 1,0-1,0 1,1-1,-1 1,0-1,0 1,0-1,0 1,0-1,0 0,0 1,0-1,0 1,0-1,-1 1,1-1,0 1,0-1,0 0,-1 1,1-1,0 1,0-1,-1 0,1 1,0-1,-1 0,1 1,0-1,-1 0,1 1,0-1,-1 0,1 0,-1 0,1 1,-1-1,1 0,0 0,-1 0,1 0,-2 0,-25 9,-50 7,40-10,-70 23,93-23,-1-1,1-1,-1-1,0 0,0 0,0-2,0 0,0 0,0-1,0-1,-28-6,-22-6,-125-11,25 3,149 17,0-1,0 0,-16-8,15 5,0 2,-28-8,-2 8,0 2,-1 1,-64 6,11 0,14-5,39 0,-88 7,122-1,1 0,-1 1,1 0,0 1,1 0,-1 1,1 1,-16 13,15-12,10-7,0 1,0-1,1 0,-1 1,1 0,0-1,0 1,0 0,0 0,0 0,-1 5,3-7,-1 1,0-1,1 1,0 0,-1-1,1 1,0 0,0-1,0 1,0 0,0 0,0-1,0 1,1 0,-1-1,1 1,-1 0,1-1,-1 1,1-1,0 1,0-1,0 1,2 1,4 4,1 1,-1 1,0-1,-1 1,0 0,-1 0,0 1,0 0,-1-1,0 2,5 19,-9-27,1 0,0 0,0 0,0 0,1 0,-1 0,1 0,0 0,-1-1,1 1,0-1,1 1,-1-1,0 0,1 0,-1 0,1 0,0 0,-1-1,1 1,0-1,0 0,0 0,0 0,0 0,0 0,6 0,8 1,1-1,-1 0,1-2,18-2,2 1,-22 0,0 0,0-1,0-1,21-8,-19 7,0-1,0 2,20-2,53 1,36-4,-33 1,163 6,-121 4,484-2,-598 0</inkml:trace>
+</inkml:ink>
+</file>
+
+<file path=word/ink/ink3.xml><?xml version="1.0" encoding="utf-8"?>
+<inkml:ink xmlns:inkml="http://www.w3.org/2003/InkML">
+  <inkml:definitions>
+    <inkml:context xml:id="ctx0">
+      <inkml:inkSource xml:id="inkSrc0">
+        <inkml:traceFormat>
+          <inkml:channel name="X" type="integer" min="-2.14748E9" max="2.14748E9" units="cm"/>
+          <inkml:channel name="Y" type="integer" min="-2.14748E9" max="2.14748E9" units="cm"/>
+        </inkml:traceFormat>
+        <inkml:channelProperties>
+          <inkml:channelProperty channel="X" name="resolution" value="1000" units="1/cm"/>
+          <inkml:channelProperty channel="Y" name="resolution" value="1000" units="1/cm"/>
+        </inkml:channelProperties>
+      </inkml:inkSource>
+      <inkml:timestamp xml:id="ts0" timeString="2025-02-22T06:27:42.158"/>
+    </inkml:context>
+    <inkml:brush xml:id="br0">
+      <inkml:brushProperty name="width" value="0.1" units="cm"/>
+      <inkml:brushProperty name="height" value="0.2" units="cm"/>
+      <inkml:brushProperty name="color" value="#FFFC00"/>
+      <inkml:brushProperty name="tip" value="rectangle"/>
+      <inkml:brushProperty name="rasterOp" value="maskPen"/>
+      <inkml:brushProperty name="ignorePressure" value="1"/>
+    </inkml:brush>
+  </inkml:definitions>
+  <inkml:trace contextRef="#ctx0" brushRef="#br0">1 170,'46'-2,"0"-2,73-17,-87 15,0 1,33 0,-44 4,-1 0,0-2,1 0,-1-1,29-10,-21 2,1 2,1 0,0 2,0 2,0 0,59-2,19-2,2 0,-68 10,-1-1,51-10,-9 2,-655 10,542 0,-43 9,-13 0,52-7,-1 3,2 0,-1 3,-52 19,39-12,20-10,1-1,-1-2,0-1,-34-1,47-1,617-1,-312 2,-265 0,45 9,-42-6,34 2,-10-5,-31-1</inkml:trace>
+</inkml:ink>
+</file>
+
+<file path=word/ink/ink4.xml><?xml version="1.0" encoding="utf-8"?>
+<inkml:ink xmlns:inkml="http://www.w3.org/2003/InkML">
+  <inkml:definitions>
+    <inkml:context xml:id="ctx0">
+      <inkml:inkSource xml:id="inkSrc0">
+        <inkml:traceFormat>
+          <inkml:channel name="X" type="integer" min="-2.14748E9" max="2.14748E9" units="cm"/>
+          <inkml:channel name="Y" type="integer" min="-2.14748E9" max="2.14748E9" units="cm"/>
+        </inkml:traceFormat>
+        <inkml:channelProperties>
+          <inkml:channelProperty channel="X" name="resolution" value="1000" units="1/cm"/>
+          <inkml:channelProperty channel="Y" name="resolution" value="1000" units="1/cm"/>
+        </inkml:channelProperties>
+      </inkml:inkSource>
+      <inkml:timestamp xml:id="ts0" timeString="2025-02-22T06:27:33.231"/>
+    </inkml:context>
+    <inkml:brush xml:id="br0">
+      <inkml:brushProperty name="width" value="0.1" units="cm"/>
+      <inkml:brushProperty name="height" value="0.2" units="cm"/>
+      <inkml:brushProperty name="color" value="#FFFC00"/>
+      <inkml:brushProperty name="tip" value="rectangle"/>
+      <inkml:brushProperty name="rasterOp" value="maskPen"/>
+      <inkml:brushProperty name="ignorePressure" value="1"/>
+    </inkml:brush>
+  </inkml:definitions>
+  <inkml:trace contextRef="#ctx0" brushRef="#br0">185 47,'1'-2,"0"1,1-1,-1 1,1 0,-1-1,1 1,0 0,0 0,-1 0,1 0,0 0,0 1,0-1,0 0,0 1,2-1,3-1,11-4,0 0,0 2,0 0,0 1,25 0,96 4,-59 1,409-2,-458 2,0 1,59 14,-58-10,-1-1,53 3,-53-10,-15 0,-1 1,0 1,21 2,-33-3,0 1,0 0,0-1,0 1,0 0,0 1,0-1,-1 0,1 1,0 0,-1-1,1 1,-1 0,0 0,1 1,-1-1,0 0,0 1,-1-1,1 1,2 5,-3-6,-1 0,0 0,1 0,-1 0,0 0,0 1,0-1,-1 0,1 0,0 0,-1 0,1 0,-1 0,0 0,0 0,0 0,0 0,0 0,0 0,0-1,-1 1,1 0,-1-1,1 1,-1-1,1 0,-1 1,-2 0,-6 5,0 0,0-1,-18 8,17-10,0 0,1-1,-1 0,-1-1,1 0,-19 0,-73-5,41 0,46 2,0-1,0-1,0 0,-23-9,20 6,1 1,-33-4,12 4,-41-12,50 10,0 1,-59-4,73 9,-1-1,1-1,-1-1,-19-6,17 4,0 1,-32-4,-225 6,143 5,133-2,-12-1,-1 1,1 0,0 1,-1 1,1-1,0 2,0 0,-21 8,33-11,1 0,-1 0,0 0,1 0,-1 0,0 0,1 0,-1 0,0 0,0 1,1-1,-1 0,0 0,1 0,-1 0,0 1,0-1,1 0,-1 0,0 0,0 1,1-1,-1 0,0 0,0 1,0-1,0 0,1 1,-1-1,0 0,0 0,0 1,0-1,0 0,0 1,0-1,0 0,0 1,0-1,0 0,0 1,0-1,0 0,0 1,0-1,0 0,0 1,-1-1,1 0,0 0,0 1,0-1,0 0,-1 0,1 1,0-1,0 0,-1 0,1 1,0-1,0 0,-1 0,1 0,0 0,-1 1,1-1,0 0,-1 0,1 0,26 6,52-2,84-5,-55-1,843 2,-942-1,0 0,-1 0,1 0,0-1,-1-1,10-3,-10 3,0 1,0-1,0 1,1 1,-1-1,14 0,-4 3</inkml:trace>
+</inkml:ink>
+</file>
+
 <file path=word/theme/theme1.xml><?xml version="1.0" encoding="utf-8"?>
 <a:theme xmlns:a="http://schemas.openxmlformats.org/drawingml/2006/main" name="Office Theme">
   <a:themeElements>

</xml_diff>